<commit_message>
Added new template and routes
</commit_message>
<xml_diff>
--- a/src/templates/contrato.docx
+++ b/src/templates/contrato.docx
@@ -113,351 +113,403 @@
     <w:p>
       <w:pPr>
         <w:widowControl w:val="0"/>
+        <w:rPr>
+          <w:color w:val="000000" w:themeColor="text1"/>
+        </w:rPr>
       </w:pPr>
       <w:r>
+        <w:rPr>
+          <w:color w:val="000000" w:themeColor="text1"/>
+        </w:rPr>
         <w:t>Entre:</w:t>
       </w:r>
       <w:r>
-        <w:br/>
-      </w:r>
-      <w:r>
+        <w:rPr>
+          <w:color w:val="000000" w:themeColor="text1"/>
+        </w:rPr>
+        <w:br/>
+      </w:r>
+      <w:r>
+        <w:rPr>
+          <w:color w:val="000000" w:themeColor="text1"/>
+        </w:rPr>
         <w:br/>
         <w:t>a pessoa jurídica</w:t>
       </w:r>
       <w:r>
         <w:rPr>
           <w:b/>
+          <w:color w:val="000000" w:themeColor="text1"/>
         </w:rPr>
         <w:t xml:space="preserve"> Rony Motos</w:t>
       </w:r>
       <w:r>
+        <w:rPr>
+          <w:color w:val="000000" w:themeColor="text1"/>
+        </w:rPr>
         <w:t>, inscrita sob o CNPJ n.º 63.546.586/0001-04, com sede em RUA ELPIDIO RODRIGUES, 321, CENTRO, NOVO ORIENTE-CE,</w:t>
       </w:r>
       <w:r>
+        <w:rPr>
+          <w:color w:val="000000" w:themeColor="text1"/>
+        </w:rPr>
         <w:br/>
         <w:t>neste ato representada, conforme poderes especialmente conferidos</w:t>
       </w:r>
       <w:r>
+        <w:rPr>
+          <w:color w:val="000000" w:themeColor="text1"/>
+        </w:rPr>
         <w:t xml:space="preserve"> a</w:t>
       </w:r>
       <w:r>
+        <w:rPr>
+          <w:color w:val="000000" w:themeColor="text1"/>
+        </w:rPr>
         <w:br/>
         <w:t>Ronivon Silva Ribeiro, na qualidade de</w:t>
       </w:r>
       <w:r>
+        <w:rPr>
+          <w:color w:val="000000" w:themeColor="text1"/>
+        </w:rPr>
         <w:t xml:space="preserve"> </w:t>
       </w:r>
       <w:r>
+        <w:rPr>
+          <w:color w:val="000000" w:themeColor="text1"/>
+        </w:rPr>
         <w:t xml:space="preserve">PROPRIETARIO DO ESTABELECIMENTO, </w:t>
       </w:r>
       <w:r>
+        <w:rPr>
+          <w:color w:val="000000" w:themeColor="text1"/>
+        </w:rPr>
         <w:br/>
         <w:t>doravante denominad</w:t>
       </w:r>
       <w:r>
+        <w:rPr>
+          <w:color w:val="000000" w:themeColor="text1"/>
+        </w:rPr>
         <w:t>o</w:t>
       </w:r>
       <w:r>
         <w:rPr>
           <w:b/>
+          <w:color w:val="000000" w:themeColor="text1"/>
         </w:rPr>
         <w:t xml:space="preserve"> VENDEDOR</w:t>
       </w:r>
       <w:r>
+        <w:rPr>
+          <w:color w:val="000000" w:themeColor="text1"/>
+        </w:rPr>
         <w:t>,</w:t>
       </w:r>
       <w:r>
+        <w:rPr>
+          <w:color w:val="000000" w:themeColor="text1"/>
+        </w:rPr>
         <w:br/>
         <w:t>e:</w:t>
       </w:r>
       <w:r>
         <w:rPr>
           <w:b/>
+          <w:color w:val="000000" w:themeColor="text1"/>
         </w:rPr>
         <w:t xml:space="preserve"> </w:t>
       </w:r>
       <w:r>
         <w:rPr>
-          <w:rFonts w:ascii="Menlo" w:hAnsi="Menlo" w:cs="Menlo"/>
-          <w:color w:val="CCCCCC"/>
-          <w:sz w:val="20"/>
-          <w:szCs w:val="20"/>
+          <w:color w:val="000000" w:themeColor="text1"/>
         </w:rPr>
         <w:t>{{comprador}}</w:t>
       </w:r>
       <w:r>
+        <w:rPr>
+          <w:color w:val="000000" w:themeColor="text1"/>
+        </w:rPr>
         <w:t>,</w:t>
       </w:r>
       <w:r>
+        <w:rPr>
+          <w:color w:val="000000" w:themeColor="text1"/>
+        </w:rPr>
         <w:t xml:space="preserve"> </w:t>
       </w:r>
       <w:r>
+        <w:rPr>
+          <w:color w:val="000000" w:themeColor="text1"/>
+        </w:rPr>
         <w:t xml:space="preserve">nacionalidade: brasileiro, </w:t>
       </w:r>
       <w:r>
+        <w:rPr>
+          <w:color w:val="000000" w:themeColor="text1"/>
+        </w:rPr>
         <w:t>identificação</w:t>
       </w:r>
       <w:r>
+        <w:rPr>
+          <w:color w:val="000000" w:themeColor="text1"/>
+        </w:rPr>
         <w:t xml:space="preserve"> n.º</w:t>
       </w:r>
       <w:r>
+        <w:rPr>
+          <w:color w:val="000000" w:themeColor="text1"/>
+        </w:rPr>
+        <w:t xml:space="preserve"> {{comprador_cpf}}</w:t>
+      </w:r>
+      <w:r>
+        <w:rPr>
+          <w:color w:val="000000" w:themeColor="text1"/>
+        </w:rPr>
+        <w:t>, residente em:</w:t>
+      </w:r>
+      <w:r>
+        <w:rPr>
+          <w:color w:val="000000" w:themeColor="text1"/>
+        </w:rPr>
+        <w:t xml:space="preserve"> {{comprador_endereco}}</w:t>
+      </w:r>
+      <w:r>
+        <w:rPr>
+          <w:color w:val="000000" w:themeColor="text1"/>
+        </w:rPr>
+        <w:t>, doravante denominado</w:t>
+      </w:r>
+      <w:r>
+        <w:rPr>
+          <w:b/>
+          <w:color w:val="000000" w:themeColor="text1"/>
+        </w:rPr>
+        <w:t xml:space="preserve"> COMPRADOR</w:t>
+      </w:r>
+      <w:r>
+        <w:rPr>
+          <w:color w:val="000000" w:themeColor="text1"/>
+        </w:rPr>
+        <w:t>.</w:t>
+      </w:r>
+    </w:p>
+    <w:p>
+      <w:pPr>
+        <w:rPr>
+          <w:color w:val="000000" w:themeColor="text1"/>
+        </w:rPr>
+      </w:pPr>
+      <w:r>
+        <w:rPr>
+          <w:color w:val="000000" w:themeColor="text1"/>
+        </w:rPr>
+        <w:br/>
+        <w:t>As partes acima identificadas têm entre si justo e acertado o presente contrato de compra e venda de veículo, ficando desde já aceito nas cláusulas e condições abaixo descritas.</w:t>
+      </w:r>
+    </w:p>
+    <w:p>
+      <w:pPr>
+        <w:rPr>
+          <w:color w:val="000000" w:themeColor="text1"/>
+        </w:rPr>
+      </w:pPr>
+      <w:r>
+        <w:rPr>
+          <w:b/>
+          <w:color w:val="000000" w:themeColor="text1"/>
+        </w:rPr>
+        <w:t>CLÁUSULA 1ª – DO OBJETO</w:t>
+      </w:r>
+    </w:p>
+    <w:p>
+      <w:pPr>
+        <w:rPr>
+          <w:color w:val="000000" w:themeColor="text1"/>
+        </w:rPr>
+      </w:pPr>
+      <w:r>
+        <w:rPr>
+          <w:color w:val="000000" w:themeColor="text1"/>
+        </w:rPr>
+        <w:t>O</w:t>
+      </w:r>
+      <w:r>
+        <w:rPr>
+          <w:b/>
+          <w:color w:val="000000" w:themeColor="text1"/>
+        </w:rPr>
+        <w:t xml:space="preserve"> VENDEDOR</w:t>
+      </w:r>
+      <w:r>
+        <w:rPr>
+          <w:color w:val="000000" w:themeColor="text1"/>
+        </w:rPr>
+        <w:t xml:space="preserve"> compromete-se por meio deste contrato a vender ao</w:t>
+      </w:r>
+      <w:r>
+        <w:rPr>
+          <w:b/>
+          <w:color w:val="000000" w:themeColor="text1"/>
+        </w:rPr>
+        <w:t xml:space="preserve"> COMPRADOR</w:t>
+      </w:r>
+      <w:r>
+        <w:rPr>
+          <w:color w:val="000000" w:themeColor="text1"/>
+        </w:rPr>
+        <w:t xml:space="preserve"> o veículo automotor modelo</w:t>
+      </w:r>
+      <w:r>
+        <w:rPr>
+          <w:color w:val="000000" w:themeColor="text1"/>
+        </w:rPr>
+        <w:t xml:space="preserve"> {{veiculo_modelo}}</w:t>
+      </w:r>
+      <w:r>
+        <w:rPr>
+          <w:color w:val="000000" w:themeColor="text1"/>
+        </w:rPr>
+        <w:t>, ano de fabricação e modelo</w:t>
+      </w:r>
+      <w:r>
+        <w:rPr>
+          <w:color w:val="000000" w:themeColor="text1"/>
+        </w:rPr>
+        <w:t xml:space="preserve"> {{veiculo_ano}}</w:t>
+      </w:r>
+      <w:r>
+        <w:rPr>
+          <w:color w:val="000000" w:themeColor="text1"/>
+        </w:rPr>
+        <w:t xml:space="preserve">, cor </w:t>
+      </w:r>
+      <w:r>
+        <w:rPr>
+          <w:color w:val="000000" w:themeColor="text1"/>
+        </w:rPr>
+        <w:t xml:space="preserve">{{veiculo_cor}} </w:t>
+      </w:r>
+      <w:r>
+        <w:rPr>
+          <w:color w:val="000000" w:themeColor="text1"/>
+        </w:rPr>
+        <w:t xml:space="preserve">e com placa </w:t>
+      </w:r>
+      <w:r>
+        <w:rPr>
+          <w:color w:val="000000" w:themeColor="text1"/>
+        </w:rPr>
+        <w:t>{{veiculo_placa}}</w:t>
+      </w:r>
+      <w:r>
+        <w:rPr>
+          <w:color w:val="000000" w:themeColor="text1"/>
+        </w:rPr>
+        <w:t>.</w:t>
+      </w:r>
+    </w:p>
+    <w:p>
+      <w:r>
+        <w:t>§ 1º. O veículo objeto deste contrato é usado, apresentando desgaste natural decorrente do tempo, e foi devidamente vistoriado e inspecionado pelo</w:t>
+      </w:r>
+      <w:r>
+        <w:rPr>
+          <w:b/>
+        </w:rPr>
+        <w:t xml:space="preserve"> COMPRADOR</w:t>
+      </w:r>
+      <w:r>
+        <w:t>, que tomou ciência de suas condições e estado de conservação.</w:t>
+      </w:r>
+    </w:p>
+    <w:p>
+      <w:r>
+        <w:t>§ 2º. O veículo encontra-se livre de qualquer ônus ou encargos.</w:t>
+      </w:r>
+    </w:p>
+    <w:p>
+      <w:r>
+        <w:t>§ 3º. Eventuais débitos ou restrições do veículo objeto deste contrato, tais como multa, IPVA, licenciamento, restrições financeiras, tributárias, judiciárias, administrativas, dentre outras, ocorridos até a transferência da posse do veículo para o</w:t>
+      </w:r>
+      <w:r>
+        <w:rPr>
+          <w:b/>
+        </w:rPr>
+        <w:t xml:space="preserve"> COMPRADOR</w:t>
+      </w:r>
+      <w:r>
+        <w:t>, mesmo que ainda pendentes de lançamento pelo órgão competente, são de inteira responsabilidade  d</w:t>
+      </w:r>
+      <w:r>
+        <w:t>o</w:t>
+      </w:r>
+      <w:r>
+        <w:rPr>
+          <w:b/>
+        </w:rPr>
+        <w:t xml:space="preserve"> VENDEDOR</w:t>
+      </w:r>
+      <w:r>
+        <w:t>.</w:t>
+      </w:r>
+    </w:p>
+    <w:p>
+      <w:r>
+        <w:br/>
+      </w:r>
+      <w:r>
+        <w:rPr>
+          <w:b/>
+        </w:rPr>
+        <w:t>CLÁUSULA 2ª – DO PREÇO</w:t>
+      </w:r>
+    </w:p>
+    <w:p>
+      <w:r>
+        <w:t>{{condições_pagamento}}</w:t>
+      </w:r>
+    </w:p>
+    <w:p>
+      <w:r>
+        <w:t>§ 1º. O</w:t>
+      </w:r>
+      <w:r>
+        <w:rPr>
+          <w:b/>
+        </w:rPr>
+        <w:t xml:space="preserve"> COMPRADOR</w:t>
+      </w:r>
+      <w:r>
+        <w:t xml:space="preserve"> não vindo a efetuar o pagamento, fica obrigado a pagar multa de 3% (três por cento) sobre o valor devido, bem como juros de 1% (um por cento) ao mês, mais correção monetária apurada conforme variação do IGP-M no período.</w:t>
+      </w:r>
+    </w:p>
+    <w:p>
+      <w:r>
+        <w:t>§ 2º. Caso ocorra atraso no pagamento de uma ou mais parcelas por um período superior à 30 (trinta) dias, fica o</w:t>
+      </w:r>
+      <w:r>
+        <w:rPr>
+          <w:b/>
+        </w:rPr>
+        <w:t xml:space="preserve"> COMPRADOR</w:t>
+      </w:r>
+      <w:r>
+        <w:t xml:space="preserve"> sujeito a ter a posse do veículo configurada como Apropriação Indébita, implicando também a possibilidade de adoção de medidas judiciais, inclusive a Busca e Apreensão do veículo e/ou lavratura de Boletim de Ocorrência, cabendo ao</w:t>
+      </w:r>
+      <w:r>
+        <w:rPr>
+          <w:b/>
+        </w:rPr>
+        <w:t xml:space="preserve"> COMPRADOR</w:t>
+      </w:r>
+      <w:r>
         <w:t xml:space="preserve"> </w:t>
       </w:r>
       <w:r>
-        <w:rPr>
-          <w:rFonts w:ascii="Menlo" w:hAnsi="Menlo" w:cs="Menlo"/>
-          <w:color w:val="CCCCCC"/>
-          <w:sz w:val="20"/>
-          <w:szCs w:val="20"/>
-        </w:rPr>
-        <w:t>{{comprador_cpf}}</w:t>
-      </w:r>
-      <w:r>
-        <w:t>, residente em:</w:t>
-      </w:r>
-      <w:r>
-        <w:t xml:space="preserve"> </w:t>
-      </w:r>
-      <w:r>
-        <w:rPr>
-          <w:rFonts w:ascii="Menlo" w:hAnsi="Menlo" w:cs="Menlo"/>
-          <w:color w:val="CCCCCC"/>
-          <w:sz w:val="20"/>
-          <w:szCs w:val="20"/>
-        </w:rPr>
-        <w:t>{{comprador_endereco}}</w:t>
-      </w:r>
-      <w:r>
-        <w:t>, doravante denominado</w:t>
-      </w:r>
-      <w:r>
-        <w:rPr>
-          <w:b/>
-        </w:rPr>
-        <w:t xml:space="preserve"> COMPRADOR</w:t>
-      </w:r>
-      <w:r>
-        <w:t>.</w:t>
-      </w:r>
-    </w:p>
-    <w:p>
-      <w:r>
-        <w:br/>
-        <w:t>As partes acima identificadas têm entre si justo e acertado o presente contrato de compra e venda de veículo, ficando desde já aceito nas cláusulas e condições abaixo descritas.</w:t>
-      </w:r>
-    </w:p>
-    <w:p>
-      <w:r>
-        <w:rPr>
-          <w:b/>
-        </w:rPr>
-        <w:t>CLÁUSULA 1ª – DO OBJETO</w:t>
-      </w:r>
-    </w:p>
-    <w:p>
-      <w:r>
-        <w:t>O</w:t>
-      </w:r>
-      <w:r>
-        <w:rPr>
-          <w:b/>
-        </w:rPr>
-        <w:t xml:space="preserve"> VENDEDOR</w:t>
-      </w:r>
-      <w:r>
-        <w:t xml:space="preserve"> compromete-se por meio deste contrato a vender ao</w:t>
-      </w:r>
-      <w:r>
-        <w:rPr>
-          <w:b/>
-        </w:rPr>
-        <w:t xml:space="preserve"> COMPRADOR</w:t>
-      </w:r>
-      <w:r>
-        <w:t xml:space="preserve"> o veículo automotor modelo</w:t>
-      </w:r>
-      <w:r>
-        <w:t xml:space="preserve"> </w:t>
-      </w:r>
-      <w:r>
-        <w:rPr>
-          <w:rFonts w:ascii="Menlo" w:hAnsi="Menlo" w:cs="Menlo"/>
-          <w:color w:val="CCCCCC"/>
-          <w:sz w:val="20"/>
-          <w:szCs w:val="20"/>
-        </w:rPr>
-        <w:t>{{veiculo_modelo}}</w:t>
-      </w:r>
-      <w:r>
-        <w:t>, ano de fabricação e modelo</w:t>
-      </w:r>
-      <w:r>
-        <w:t xml:space="preserve"> </w:t>
-      </w:r>
-      <w:r>
-        <w:rPr>
-          <w:rFonts w:ascii="Menlo" w:hAnsi="Menlo" w:cs="Menlo"/>
-          <w:color w:val="CCCCCC"/>
-          <w:sz w:val="20"/>
-          <w:szCs w:val="20"/>
-        </w:rPr>
-        <w:t>{{veiculo_ano}}</w:t>
-      </w:r>
-      <w:r>
-        <w:t xml:space="preserve">, cor </w:t>
-      </w:r>
-      <w:r>
-        <w:rPr>
-          <w:rFonts w:ascii="Menlo" w:hAnsi="Menlo" w:cs="Menlo"/>
-          <w:color w:val="CCCCCC"/>
-          <w:sz w:val="20"/>
-          <w:szCs w:val="20"/>
-        </w:rPr>
-        <w:t>{{veiculo_cor}}</w:t>
-      </w:r>
-      <w:r>
-        <w:t xml:space="preserve"> </w:t>
-      </w:r>
-      <w:r>
-        <w:t xml:space="preserve">e com placa </w:t>
-      </w:r>
-      <w:r>
-        <w:rPr>
-          <w:rFonts w:ascii="Menlo" w:hAnsi="Menlo" w:cs="Menlo"/>
-          <w:color w:val="CCCCCC"/>
-          <w:sz w:val="20"/>
-          <w:szCs w:val="20"/>
-        </w:rPr>
-        <w:t>{{veiculo_placa}}</w:t>
-      </w:r>
-      <w:r>
-        <w:t>.</w:t>
-      </w:r>
-    </w:p>
-    <w:p>
-      <w:r>
-        <w:t>§ 1º. O veículo objeto deste contrato é usado, apresentando desgaste natural decorrente do tempo, e foi devidamente vistoriado e inspecionado pelo</w:t>
-      </w:r>
-      <w:r>
-        <w:rPr>
-          <w:b/>
-        </w:rPr>
-        <w:t xml:space="preserve"> COMPRADOR</w:t>
-      </w:r>
-      <w:r>
-        <w:t>, que tomou ciência de suas condições e estado de conservação.</w:t>
-      </w:r>
-    </w:p>
-    <w:p>
-      <w:r>
-        <w:t>§ 2º. O veículo encontra-se livre de qualquer ônus ou encargos.</w:t>
-      </w:r>
-    </w:p>
-    <w:p>
-      <w:r>
-        <w:t>§ 3º. Eventuais débitos ou restrições do veículo objeto deste contrato, tais como multa, IPVA, licenciamento, restrições financeiras, tributárias, judiciárias, administrativas, dentre outras, ocorridos até a transferência da posse do veículo para o</w:t>
-      </w:r>
-      <w:r>
-        <w:rPr>
-          <w:b/>
-        </w:rPr>
-        <w:t xml:space="preserve"> COMPRADOR</w:t>
-      </w:r>
-      <w:r>
-        <w:t>, mesmo que ainda pendentes de lançamento pelo órgão competente, são de inteira responsabilidade  d</w:t>
-      </w:r>
-      <w:r>
-        <w:t>o</w:t>
-      </w:r>
-      <w:r>
-        <w:rPr>
-          <w:b/>
-        </w:rPr>
-        <w:t xml:space="preserve"> VENDEDOR</w:t>
-      </w:r>
-      <w:r>
-        <w:t>.</w:t>
-      </w:r>
-    </w:p>
-    <w:p>
-      <w:r>
-        <w:br/>
-      </w:r>
-      <w:r>
-        <w:rPr>
-          <w:b/>
-        </w:rPr>
-        <w:t>CLÁUSULA 2ª – DO PREÇO</w:t>
-      </w:r>
-    </w:p>
-    <w:p>
-      <w:r>
-        <w:t xml:space="preserve">O valor da presente negociação, ajustado livremente entre as partes, é de R$ </w:t>
-      </w:r>
-      <w:r>
-        <w:rPr>
-          <w:rFonts w:ascii="Menlo" w:hAnsi="Menlo" w:cs="Menlo"/>
-          <w:color w:val="CCCCCC"/>
-          <w:sz w:val="20"/>
-          <w:szCs w:val="20"/>
-        </w:rPr>
-        <w:t>{{valor_venda}}</w:t>
-      </w:r>
-      <w:r>
-        <w:t>, que será pago nas seguintes condições:</w:t>
-      </w:r>
-      <w:r>
-        <w:t xml:space="preserve"> </w:t>
-      </w:r>
-      <w:r>
-        <w:rPr>
-          <w:rFonts w:ascii="Menlo" w:hAnsi="Menlo" w:cs="Menlo"/>
-          <w:color w:val="CCCCCC"/>
-          <w:sz w:val="20"/>
-          <w:szCs w:val="20"/>
-        </w:rPr>
-        <w:t xml:space="preserve">{{valor_sinal}} {{qtd_parcelas}} {{valor_parcelas}} {{data_pagamento_parcela}} </w:t>
-      </w:r>
-    </w:p>
-    <w:p>
-      <w:r>
-        <w:t>§ 1º. O</w:t>
-      </w:r>
-      <w:r>
-        <w:rPr>
-          <w:b/>
-        </w:rPr>
-        <w:t xml:space="preserve"> COMPRADOR</w:t>
-      </w:r>
-      <w:r>
-        <w:t xml:space="preserve"> não vindo a efetuar o pagamento, fica obrigado a pagar multa de 3% (três por cento) sobre o valor devido, bem como juros de 1% (um por cento) ao mês, mais correção monetária apurada conforme variação do IGP-M no período.</w:t>
-      </w:r>
-    </w:p>
-    <w:p>
-      <w:r>
-        <w:t>§ 2º. Caso ocorra atraso no pagamento de uma ou mais parcelas por um período superior à 30 (trinta) dias, fica o</w:t>
-      </w:r>
-      <w:r>
-        <w:rPr>
-          <w:b/>
-        </w:rPr>
-        <w:t xml:space="preserve"> COMPRADOR</w:t>
-      </w:r>
-      <w:r>
-        <w:t xml:space="preserve"> sujeito a ter a posse do veículo configurada como Apropriação </w:t>
-      </w:r>
-      <w:r>
         <w:lastRenderedPageBreak/>
-        <w:t>Indébita, implicando também a possibilidade de adoção de medidas judiciais, inclusive a Busca e Apreensão do veículo e/ou lavratura de Boletim de Ocorrência, cabendo ao</w:t>
-      </w:r>
-      <w:r>
-        <w:rPr>
-          <w:b/>
-        </w:rPr>
-        <w:t xml:space="preserve"> COMPRADOR</w:t>
-      </w:r>
-      <w:r>
-        <w:t xml:space="preserve"> ressarcir a</w:t>
+        <w:t>ressarcir a</w:t>
       </w:r>
       <w:r>
         <w:rPr>
@@ -752,7 +804,6 @@
         <w:ind w:left="240" w:right="120"/>
       </w:pPr>
       <w:r>
-        <w:lastRenderedPageBreak/>
         <w:t>II – efetuar o registro do veículo junto aos órgãos de trânsito, em um prazo máximo de 30 dias após a entrega do registro do veículo devidamente preenchido pel</w:t>
       </w:r>
       <w:r>
@@ -774,6 +825,7 @@
         <w:ind w:left="240" w:right="120"/>
       </w:pPr>
       <w:r>
+        <w:lastRenderedPageBreak/>
         <w:t>III – se responsabilizar, após a assinatura deste instrumento, pelos impostos e taxas que incidirem sobre o veículo adquirido.</w:t>
       </w:r>
     </w:p>
@@ -1048,7 +1100,7 @@
       <w:rPr>
         <w:noProof/>
       </w:rPr>
-      <w:pict w14:anchorId="56039699">
+      <w:pict w14:anchorId="15082322">
         <v:shapetype id="_x0000_t75" coordsize="21600,21600" o:spt="75" o:preferrelative="t" path="m@4@5l@4@11@9@11@9@5xe" filled="f" stroked="f">
           <v:stroke joinstyle="miter"/>
           <v:formulas>
@@ -1097,7 +1149,7 @@
           <w:rPr>
             <w:noProof/>
           </w:rPr>
-          <w:pict w14:anchorId="10B11FC5">
+          <w:pict w14:anchorId="1495E8BF">
             <v:shapetype id="_x0000_t75" coordsize="21600,21600" o:spt="75" o:preferrelative="t" path="m@4@5l@4@11@9@11@9@5xe" filled="f" stroked="f">
               <v:stroke joinstyle="miter"/>
               <v:formulas>
@@ -1139,7 +1191,7 @@
       <w:rPr>
         <w:noProof/>
       </w:rPr>
-      <w:pict w14:anchorId="636EDA4A">
+      <w:pict w14:anchorId="64FEA4DA">
         <v:shapetype id="_x0000_t75" coordsize="21600,21600" o:spt="75" o:preferrelative="t" path="m@4@5l@4@11@9@11@9@5xe" filled="f" stroked="f">
           <v:stroke joinstyle="miter"/>
           <v:formulas>

</xml_diff>